<commit_message>
Remove Kyle's employer references; reply to both his objections
He was named as an author having written nothing, and his bio named his former
institution, which he cannot be associated with in print. Both objections are
correct.

Employer references removed in full and verified at zero. Added an explicit line
that the audit failure patterns are general practice and not drawn from any
identified organisation, because his name above that section invites the
inference regardless of attribution.

Reply offers three options with no recommendation: write the section and be an
author, come off the byline, or have the section cut. Pushing him to stay would
confirm the concern he raised.

If he picks option 2 or 3, both verifiers assert his name is present and need
their needles updated in the same change.

Co-Authored-By: Claude Opus 5 <noreply@anthropic.com>
Claude-Session: https://claude.ai/code/session_01W9UtE7X76spacWeSvBH7tv
</commit_message>
<xml_diff>
--- a/research/Employment_Records_Article_ISACA_2026-08-21.docx
+++ b/research/Employment_Records_Article_ISACA_2026-08-21.docx
@@ -610,7 +610,13 @@
         <w:spacing w:after="160" w:line="276" w:lineRule="auto"/>
       </w:pPr>
       <w:r>
-        <w:t xml:space="preserve">Three failure patterns recur, and each maps to a specific way AI-assisted drafting introduces the risk.</w:t>
+        <w:t xml:space="preserve">Three failure patterns recur, and each maps to a specific way AI-assisted drafting introduces the risk. </w:t>
+      </w:r>
+      <w:r>
+        <w:rPr>
+          <w:b/>
+        </w:rPr>
+        <w:t xml:space="preserve">They are described here as general patterns in audit and investigations practice. They are not drawn from, and do not describe, the records or examinations of any identified organisation.</w:t>
       </w:r>
     </w:p>
     <w:p>
@@ -1096,7 +1102,7 @@
         <w:t xml:space="preserve">Kyle McMullan</w:t>
       </w:r>
       <w:r>
-        <w:t xml:space="preserve"> is a Chief Audit Executive working in internal audit and financial crimes. He was previously Chief Auditor, AML International and Financial Crimes International, at Citi, and is a member of Chartered Accountants Ireland.</w:t>
+        <w:t xml:space="preserve"> is a Chief Audit Executive working in internal audit and financial crime.</w:t>
       </w:r>
     </w:p>
     <w:p>

</xml_diff>

<commit_message>
research: regenerate the ISACA docx from the rewritten markdown
The .docx was last built 21 August, before Kyle McMullan's edits, so it
still carried the old title, his byline and bio, the unanswered circularity,
the wrong disclaimer and the sample-size claim.

Rebuilt with research/md_to_docx.py and verified by reading word/document.xml
directly: 16 assertions, 0 failed.

Co-Authored-By: Claude Opus 5 <noreply@anthropic.com>
Claude-Session: https://claude.ai/code/session_01W9UtE7X76spacWeSvBH7tv
</commit_message>
<xml_diff>
--- a/research/Employment_Records_Article_ISACA_2026-08-21.docx
+++ b/research/Employment_Records_Article_ISACA_2026-08-21.docx
@@ -1,37 +1,37 @@
 
 <file path=word/document.xml><?xml version="1.0" encoding="utf-8"?>
-<w:document xmlns:w="http://schemas.openxmlformats.org/wordprocessingml/2006/main" xmlns:r="http://schemas.openxmlformats.org/officeDocument/2006/relationships">
+<w:document xmlns:w="http://schemas.openxmlformats.org/wordprocessingml/2006/main">
   <w:body>
     <w:p>
       <w:pPr>
         <w:pStyle w:val="Heading1"/>
-        <w:spacing w:after="120"/>
-      </w:pPr>
-      <w:r>
-        <w:t xml:space="preserve">When a Defensible Decision Becomes an Indefensible File: Testing AI-Assisted Employment Records Against What Actually Happened</w:t>
-      </w:r>
-    </w:p>
-    <w:p>
-      <w:pPr>
-        <w:spacing w:after="160" w:line="276" w:lineRule="auto"/>
-      </w:pPr>
-      <w:r>
-        <w:rPr>
-          <w:b/>
-        </w:rPr>
-        <w:t xml:space="preserve">Tanvi Pokhriyal, Kyle McMullan and Phillip Wikes</w:t>
+        <w:spacing w:after="140"/>
+      </w:pPr>
+      <w:r>
+        <w:t xml:space="preserve">When a Defensible Decision Becomes an Indefensible File: Testing a Documentation Review Against What Actually Happened</w:t>
+      </w:r>
+    </w:p>
+    <w:p>
+      <w:pPr>
+        <w:spacing w:after="140"/>
+      </w:pPr>
+      <w:r>
+        <w:rPr>
+          <w:b/>
+        </w:rPr>
+        <w:t xml:space="preserve">Tanvi Pokhriyal and Phillip Wikes</w:t>
       </w:r>
     </w:p>
     <w:p>
       <w:pPr>
         <w:pBdr>
-          <w:bottom w:val="single" w:sz="6" w:space="1" w:color="BFBFBF"/>
+          <w:bottom w:val="single" w:sz="6" w:space="1" w:color="AAAAAA"/>
         </w:pBdr>
       </w:pPr>
     </w:p>
     <w:p>
       <w:pPr>
-        <w:spacing w:after="160" w:line="276" w:lineRule="auto"/>
+        <w:spacing w:after="140"/>
       </w:pPr>
       <w:r>
         <w:t xml:space="preserve">An examiner reading a file does not have access to the decision-maker's memory. They have the record. If the record cannot show why a consequential decision was made, the decision may still have been correct, but the organisation can no longer prove it.</w:t>
@@ -39,15 +39,39 @@
     </w:p>
     <w:p>
       <w:pPr>
-        <w:spacing w:after="160" w:line="276" w:lineRule="auto"/>
-      </w:pPr>
-      <w:r>
-        <w:t xml:space="preserve">That gap is getting wider, and generative AI is why. A drafted narrative reads as finished. The logs, messages and observations that would ground it were never attached, because the text did not look like it needed them.</w:t>
-      </w:r>
-    </w:p>
-    <w:p>
-      <w:pPr>
-        <w:spacing w:after="160" w:line="276" w:lineRule="auto"/>
+        <w:spacing w:after="140"/>
+      </w:pPr>
+      <w:r>
+        <w:t xml:space="preserve">Generative AI makes that gap easier to open: a drafted narrative reads as finished, so the material that would ground it is never attached. </w:t>
+      </w:r>
+      <w:r>
+        <w:rPr>
+          <w:b/>
+        </w:rPr>
+        <w:t xml:space="preserve">That is a forward-looking concern, not a finding of this study.</w:t>
+      </w:r>
+      <w:r>
+        <w:t xml:space="preserve"> The corpus was not selected for AI involvement, </w:t>
+      </w:r>
+      <w:r>
+        <w:rPr>
+          <w:b/>
+        </w:rPr>
+        <w:t xml:space="preserve">no case in it is shown to have been AI-drafted</w:t>
+      </w:r>
+      <w:r>
+        <w:t xml:space="preserve">, and two of the three jurisdictional systems predate generative drafting. </w:t>
+      </w:r>
+      <w:r>
+        <w:rPr>
+          <w:b/>
+        </w:rPr>
+        <w:t xml:space="preserve">What is tested is whether the review separates records that can carry their own reasoning from records that cannot, whatever produced them.</w:t>
+      </w:r>
+    </w:p>
+    <w:p>
+      <w:pPr>
+        <w:spacing w:after="140"/>
       </w:pPr>
       <w:r>
         <w:t xml:space="preserve">We call the condition Decision Reconstruction Risk: the state a record is in when it can no longer show, on its own terms, why a consequential decision was reached.</w:t>
@@ -55,16 +79,22 @@
     </w:p>
     <w:p>
       <w:pPr>
-        <w:spacing w:after="160" w:line="276" w:lineRule="auto"/>
-      </w:pPr>
-      <w:r>
-        <w:t xml:space="preserve">This article reports what happened when one of us applied a structured review to 22 real adjudicated employment matters, recorded the review before knowing how each matter resolved, and then compared the two.</w:t>
+        <w:spacing w:after="140"/>
+      </w:pPr>
+      <w:r>
+        <w:t xml:space="preserve">This article reports what happened when one of us applied a structured review to 22 real adjudicated employment matters, recorded the review before consulting how each matter resolved, and then compared the two. </w:t>
+      </w:r>
+      <w:r>
+        <w:rPr>
+          <w:b/>
+        </w:rPr>
+        <w:t xml:space="preserve">The records are not AI-generated and are not claimed to be.</w:t>
       </w:r>
     </w:p>
     <w:p>
       <w:pPr>
         <w:pStyle w:val="Heading2"/>
-        <w:spacing w:before="360" w:after="120"/>
+        <w:spacing w:after="140"/>
       </w:pPr>
       <w:r>
         <w:t xml:space="preserve">The review</w:t>
@@ -72,7 +102,7 @@
     </w:p>
     <w:p>
       <w:pPr>
-        <w:spacing w:after="160" w:line="276" w:lineRule="auto"/>
+        <w:spacing w:after="140"/>
       </w:pPr>
       <w:r>
         <w:t xml:space="preserve">The review asks one question of a record: can a later, independent reviewer rebuild how the conclusion was reached from the record alone?</w:t>
@@ -80,7 +110,7 @@
     </w:p>
     <w:p>
       <w:pPr>
-        <w:spacing w:after="160" w:line="276" w:lineRule="auto"/>
+        <w:spacing w:after="140"/>
       </w:pPr>
       <w:r>
         <w:t xml:space="preserve">Five conditions carry that question:</w:t>
@@ -88,11 +118,12 @@
     </w:p>
     <w:p>
       <w:pPr>
-        <w:spacing w:after="160" w:line="276" w:lineRule="auto"/>
-      </w:pPr>
-      <w:r>
-        <w:t xml:space="preserve">- </w:t>
-      </w:r>
+        <w:numPr>
+          <w:ilvl w:val="0"/>
+          <w:numId w:val="1"/>
+        </w:numPr>
+        <w:spacing w:after="60"/>
+      </w:pPr>
       <w:r>
         <w:rPr>
           <w:b/>
@@ -105,11 +136,12 @@
     </w:p>
     <w:p>
       <w:pPr>
-        <w:spacing w:after="160" w:line="276" w:lineRule="auto"/>
-      </w:pPr>
-      <w:r>
-        <w:t xml:space="preserve">- </w:t>
-      </w:r>
+        <w:numPr>
+          <w:ilvl w:val="0"/>
+          <w:numId w:val="1"/>
+        </w:numPr>
+        <w:spacing w:after="60"/>
+      </w:pPr>
       <w:r>
         <w:rPr>
           <w:b/>
@@ -122,11 +154,12 @@
     </w:p>
     <w:p>
       <w:pPr>
-        <w:spacing w:after="160" w:line="276" w:lineRule="auto"/>
-      </w:pPr>
-      <w:r>
-        <w:t xml:space="preserve">- </w:t>
-      </w:r>
+        <w:numPr>
+          <w:ilvl w:val="0"/>
+          <w:numId w:val="1"/>
+        </w:numPr>
+        <w:spacing w:after="60"/>
+      </w:pPr>
       <w:r>
         <w:rPr>
           <w:b/>
@@ -139,11 +172,12 @@
     </w:p>
     <w:p>
       <w:pPr>
-        <w:spacing w:after="160" w:line="276" w:lineRule="auto"/>
-      </w:pPr>
-      <w:r>
-        <w:t xml:space="preserve">- </w:t>
-      </w:r>
+        <w:numPr>
+          <w:ilvl w:val="0"/>
+          <w:numId w:val="1"/>
+        </w:numPr>
+        <w:spacing w:after="60"/>
+      </w:pPr>
       <w:r>
         <w:rPr>
           <w:b/>
@@ -156,11 +190,12 @@
     </w:p>
     <w:p>
       <w:pPr>
-        <w:spacing w:after="160" w:line="276" w:lineRule="auto"/>
-      </w:pPr>
-      <w:r>
-        <w:t xml:space="preserve">- </w:t>
-      </w:r>
+        <w:numPr>
+          <w:ilvl w:val="0"/>
+          <w:numId w:val="1"/>
+        </w:numPr>
+        <w:spacing w:after="60"/>
+      </w:pPr>
       <w:r>
         <w:rPr>
           <w:b/>
@@ -173,7 +208,7 @@
     </w:p>
     <w:p>
       <w:pPr>
-        <w:spacing w:after="160" w:line="276" w:lineRule="auto"/>
+        <w:spacing w:after="140"/>
       </w:pPr>
       <w:r>
         <w:t xml:space="preserve">The conditions resolve to a three-level read: </w:t>
@@ -209,7 +244,7 @@
     <w:p>
       <w:pPr>
         <w:pStyle w:val="Heading2"/>
-        <w:spacing w:before="360" w:after="120"/>
+        <w:spacing w:after="140"/>
       </w:pPr>
       <w:r>
         <w:t xml:space="preserve">What the three reads look like on paper</w:t>
@@ -217,7 +252,7 @@
     </w:p>
     <w:p>
       <w:pPr>
-        <w:spacing w:after="160" w:line="276" w:lineRule="auto"/>
+        <w:spacing w:after="140"/>
       </w:pPr>
       <w:r>
         <w:t xml:space="preserve">The distinction is easier to apply than to describe, so it is worth making concrete.</w:t>
@@ -225,7 +260,7 @@
     </w:p>
     <w:p>
       <w:pPr>
-        <w:spacing w:after="160" w:line="276" w:lineRule="auto"/>
+        <w:spacing w:after="140"/>
       </w:pPr>
       <w:r>
         <w:t xml:space="preserve">A record reads </w:t>
@@ -242,7 +277,7 @@
     </w:p>
     <w:p>
       <w:pPr>
-        <w:spacing w:after="160" w:line="276" w:lineRule="auto"/>
+        <w:spacing w:after="140"/>
       </w:pPr>
       <w:r>
         <w:t xml:space="preserve">states what was alleged, identifies where each factual claim came from, shows the sequence</w:t>
@@ -250,7 +285,7 @@
     </w:p>
     <w:p>
       <w:pPr>
-        <w:spacing w:after="160" w:line="276" w:lineRule="auto"/>
+        <w:spacing w:after="140"/>
       </w:pPr>
       <w:r>
         <w:t xml:space="preserve">of events with dates that reconcile, names who decided what and on what basis, and carries</w:t>
@@ -258,7 +293,7 @@
     </w:p>
     <w:p>
       <w:pPr>
-        <w:spacing w:after="160" w:line="276" w:lineRule="auto"/>
+        <w:spacing w:after="140"/>
       </w:pPr>
       <w:r>
         <w:t xml:space="preserve">enough underlying material that a reader can test the conclusion rather than take it on</w:t>
@@ -266,7 +301,7 @@
     </w:p>
     <w:p>
       <w:pPr>
-        <w:spacing w:after="160" w:line="276" w:lineRule="auto"/>
+        <w:spacing w:after="140"/>
       </w:pPr>
       <w:r>
         <w:t xml:space="preserve">trust. In the corpus, Ready records typically quoted the original documentation rather than</w:t>
@@ -274,7 +309,7 @@
     </w:p>
     <w:p>
       <w:pPr>
-        <w:spacing w:after="160" w:line="276" w:lineRule="auto"/>
+        <w:spacing w:after="140"/>
       </w:pPr>
       <w:r>
         <w:t xml:space="preserve">summarising it.</w:t>
@@ -282,7 +317,7 @@
     </w:p>
     <w:p>
       <w:pPr>
-        <w:spacing w:after="160" w:line="276" w:lineRule="auto"/>
+        <w:spacing w:after="140"/>
       </w:pPr>
       <w:r>
         <w:t xml:space="preserve">A record reads </w:t>
@@ -299,7 +334,7 @@
     </w:p>
     <w:p>
       <w:pPr>
-        <w:spacing w:after="160" w:line="276" w:lineRule="auto"/>
+        <w:spacing w:after="140"/>
       </w:pPr>
       <w:r>
         <w:t xml:space="preserve">narrative is coherent, but at least one material claim traces to nothing a reader can check.</w:t>
@@ -307,7 +342,7 @@
     </w:p>
     <w:p>
       <w:pPr>
-        <w:spacing w:after="160" w:line="276" w:lineRule="auto"/>
+        <w:spacing w:after="140"/>
       </w:pPr>
       <w:r>
         <w:t xml:space="preserve">The commonest form in this corpus was a conclusion about performance or conduct stated</w:t>
@@ -315,7 +350,7 @@
     </w:p>
     <w:p>
       <w:pPr>
-        <w:spacing w:after="160" w:line="276" w:lineRule="auto"/>
+        <w:spacing w:after="140"/>
       </w:pPr>
       <w:r>
         <w:t xml:space="preserve">confidently, with the underlying observations described only in the drafter's own summary.</w:t>
@@ -323,7 +358,7 @@
     </w:p>
     <w:p>
       <w:pPr>
-        <w:spacing w:after="160" w:line="276" w:lineRule="auto"/>
+        <w:spacing w:after="140"/>
       </w:pPr>
       <w:r>
         <w:t xml:space="preserve">A record reads </w:t>
@@ -340,7 +375,7 @@
     </w:p>
     <w:p>
       <w:pPr>
-        <w:spacing w:after="160" w:line="276" w:lineRule="auto"/>
+        <w:spacing w:after="140"/>
       </w:pPr>
       <w:r>
         <w:t xml:space="preserve">What produced it is not. These are rarer and they are unmistakable once seen: the record</w:t>
@@ -348,7 +383,7 @@
     </w:p>
     <w:p>
       <w:pPr>
-        <w:spacing w:after="160" w:line="276" w:lineRule="auto"/>
+        <w:spacing w:after="140"/>
       </w:pPr>
       <w:r>
         <w:t xml:space="preserve">asserts an outcome and offers nothing behind it.</w:t>
@@ -356,7 +391,7 @@
     </w:p>
     <w:p>
       <w:pPr>
-        <w:spacing w:after="160" w:line="276" w:lineRule="auto"/>
+        <w:spacing w:after="140"/>
       </w:pPr>
       <w:r>
         <w:rPr>
@@ -370,7 +405,7 @@
     </w:p>
     <w:p>
       <w:pPr>
-        <w:spacing w:after="160" w:line="276" w:lineRule="auto"/>
+        <w:spacing w:after="140"/>
       </w:pPr>
       <w:r>
         <w:t xml:space="preserve">record looks thin to anybody who opens it. A Needs work record reads well, follows the</w:t>
@@ -378,7 +413,7 @@
     </w:p>
     <w:p>
       <w:pPr>
-        <w:spacing w:after="160" w:line="276" w:lineRule="auto"/>
+        <w:spacing w:after="140"/>
       </w:pPr>
       <w:r>
         <w:t xml:space="preserve">template, and passes a file-by-file review, which is precisely why it survives internal</w:t>
@@ -386,7 +421,7 @@
     </w:p>
     <w:p>
       <w:pPr>
-        <w:spacing w:after="160" w:line="276" w:lineRule="auto"/>
+        <w:spacing w:after="140"/>
       </w:pPr>
       <w:r>
         <w:t xml:space="preserve">checks and then fails under examination.</w:t>
@@ -395,7 +430,7 @@
     <w:p>
       <w:pPr>
         <w:pStyle w:val="Heading2"/>
-        <w:spacing w:before="360" w:after="120"/>
+        <w:spacing w:after="140"/>
       </w:pPr>
       <w:r>
         <w:t xml:space="preserve">What was tested</w:t>
@@ -403,7 +438,7 @@
     </w:p>
     <w:p>
       <w:pPr>
-        <w:spacing w:after="160" w:line="276" w:lineRule="auto"/>
+        <w:spacing w:after="140"/>
       </w:pPr>
       <w:r>
         <w:t xml:space="preserve">Twenty-two adjudicated employment and labour matters, from 22 distinct public sources, across three jurisdictional systems: United States Supreme Court decisions, United States Federal Labor Relations Authority decisions, and United Kingdom Employment Tribunal judgments. Cases were collected between 22 June and 29 July 2026 and the set closed at 22.</w:t>
@@ -411,7 +446,7 @@
     </w:p>
     <w:p>
       <w:pPr>
-        <w:spacing w:after="160" w:line="276" w:lineRule="auto"/>
+        <w:spacing w:after="140"/>
       </w:pPr>
       <w:r>
         <w:t xml:space="preserve">For each case, a practising employment specialist read the employer's record as it appeared in the decision, applied the five conditions, and recorded the result. The documented outcome and citation were recorded afterwards, from the source.</w:t>
@@ -419,7 +454,44 @@
     </w:p>
     <w:p>
       <w:pPr>
-        <w:spacing w:after="160" w:line="276" w:lineRule="auto"/>
+        <w:spacing w:after="140"/>
+      </w:pPr>
+      <w:r>
+        <w:rPr>
+          <w:b/>
+        </w:rPr>
+        <w:t xml:space="preserve">That design carries a circularity objection, and it is the first thing a careful reader should raise.</w:t>
+      </w:r>
+      <w:r>
+        <w:t xml:space="preserve"> The employer's record was read as it appears inside the adjudicated decision, and the decision both narrates the outcome and characterises the employer's evidence, so the reviewer worked from a source already containing the thing being predicted. The protocol required the read to be recorded before the outcome was consulted, but the database stores one timestamp per case rather than two, so the ordering rests on the protocol rather than a system record.</w:t>
+      </w:r>
+    </w:p>
+    <w:p>
+      <w:pPr>
+        <w:spacing w:after="140"/>
+      </w:pPr>
+      <w:r>
+        <w:rPr>
+          <w:b/>
+        </w:rPr>
+        <w:t xml:space="preserve">The objection is not answered here and must not be treated as answered.</w:t>
+      </w:r>
+      <w:r>
+        <w:t xml:space="preserve"> The association is consistent with a documentation deficiency an adjudicator also noticed, and equally consistent with a reviewer influenced by framing she could not unsee. </w:t>
+      </w:r>
+      <w:r>
+        <w:rPr>
+          <w:b/>
+        </w:rPr>
+        <w:t xml:space="preserve">Separating those requires a design this study did not use</w:t>
+      </w:r>
+      <w:r>
+        <w:t xml:space="preserve">: independent timestamping of the two steps, a second blinded reader, or employer records obtained before any adjudication.</w:t>
+      </w:r>
+    </w:p>
+    <w:p>
+      <w:pPr>
+        <w:spacing w:after="140"/>
       </w:pPr>
       <w:r>
         <w:t xml:space="preserve">This is a single-practitioner field pilot: one qualified specialist, one caseload, applied inside an ordinary workload. That is what the study is and the findings are reported at that level.</w:t>
@@ -427,7 +499,7 @@
     </w:p>
     <w:p>
       <w:pPr>
-        <w:spacing w:after="160" w:line="276" w:lineRule="auto"/>
+        <w:spacing w:after="140"/>
       </w:pPr>
       <w:r>
         <w:t xml:space="preserve">The reads came out at 13 Ready, 6 Needs work, 3 Gap. The outcomes came out at 7 sustained, 7 that did not survive review, 6 contested with no recorded disposition, and 2 adverse audit or compliance findings.</w:t>
@@ -436,7 +508,7 @@
     <w:p>
       <w:pPr>
         <w:pStyle w:val="Heading2"/>
-        <w:spacing w:before="360" w:after="120"/>
+        <w:spacing w:after="140"/>
       </w:pPr>
       <w:r>
         <w:t xml:space="preserve">What was found</w:t>
@@ -444,47 +516,203 @@
     </w:p>
     <w:p>
       <w:pPr>
-        <w:spacing w:after="160" w:line="276" w:lineRule="auto"/>
+        <w:spacing w:after="140"/>
       </w:pPr>
       <w:r>
         <w:t xml:space="preserve">Grouping Needs work with Gap, because both describe a record whose basis is incomplete, and treating an adverse finding as a matter that did not survive review or drew an adverse audit finding:</w:t>
       </w:r>
     </w:p>
-    <w:p>
-      <w:pPr>
-        <w:spacing w:after="160" w:line="276" w:lineRule="auto"/>
-      </w:pPr>
-      <w:r>
-        <w:t xml:space="preserve">| Read | Adverse finding | No adverse finding | Adverse rate |</w:t>
-      </w:r>
-    </w:p>
-    <w:p>
-      <w:pPr>
-        <w:spacing w:after="160" w:line="276" w:lineRule="auto"/>
-      </w:pPr>
-      <w:r>
-        <w:t xml:space="preserve">|---|---|---|---|</w:t>
-      </w:r>
-    </w:p>
-    <w:p>
-      <w:pPr>
-        <w:spacing w:after="160" w:line="276" w:lineRule="auto"/>
-      </w:pPr>
-      <w:r>
-        <w:t xml:space="preserve">| Needs work or Gap (n = 9) | 7 | 2 | 77.8% |</w:t>
-      </w:r>
-    </w:p>
-    <w:p>
-      <w:pPr>
-        <w:spacing w:after="160" w:line="276" w:lineRule="auto"/>
-      </w:pPr>
-      <w:r>
-        <w:t xml:space="preserve">| Ready (n = 13) | 2 | 11 | 15.4% |</w:t>
-      </w:r>
-    </w:p>
-    <w:p>
-      <w:pPr>
-        <w:spacing w:after="160" w:line="276" w:lineRule="auto"/>
+    <w:tbl>
+      <w:tblPr>
+        <w:tblStyle w:val="TableGrid"/>
+        <w:tblW w:w="9360" w:type="dxa"/>
+        <w:tblBorders>
+          <w:top w:val="single" w:sz="4" w:space="0" w:color="999999"/>
+          <w:left w:val="single" w:sz="4" w:space="0" w:color="999999"/>
+          <w:bottom w:val="single" w:sz="4" w:space="0" w:color="999999"/>
+          <w:right w:val="single" w:sz="4" w:space="0" w:color="999999"/>
+          <w:insideH w:val="single" w:sz="4" w:space="0" w:color="999999"/>
+          <w:insideV w:val="single" w:sz="4" w:space="0" w:color="999999"/>
+        </w:tblBorders>
+      </w:tblPr>
+      <w:tblGrid>
+        <w:gridCol w:w="2340"/>
+        <w:gridCol w:w="2340"/>
+        <w:gridCol w:w="2340"/>
+        <w:gridCol w:w="2340"/>
+      </w:tblGrid>
+      <w:tr>
+        <w:tc>
+          <w:tcPr>
+            <w:tcW w:w="2340" w:type="dxa"/>
+          </w:tcPr>
+          <w:p>
+            <w:pPr>
+              <w:spacing w:after="0"/>
+            </w:pPr>
+            <w:r>
+              <w:t xml:space="preserve">Read</w:t>
+            </w:r>
+          </w:p>
+        </w:tc>
+        <w:tc>
+          <w:tcPr>
+            <w:tcW w:w="2340" w:type="dxa"/>
+          </w:tcPr>
+          <w:p>
+            <w:pPr>
+              <w:spacing w:after="0"/>
+            </w:pPr>
+            <w:r>
+              <w:t xml:space="preserve">Adverse finding</w:t>
+            </w:r>
+          </w:p>
+        </w:tc>
+        <w:tc>
+          <w:tcPr>
+            <w:tcW w:w="2340" w:type="dxa"/>
+          </w:tcPr>
+          <w:p>
+            <w:pPr>
+              <w:spacing w:after="0"/>
+            </w:pPr>
+            <w:r>
+              <w:t xml:space="preserve">No adverse finding</w:t>
+            </w:r>
+          </w:p>
+        </w:tc>
+        <w:tc>
+          <w:tcPr>
+            <w:tcW w:w="2340" w:type="dxa"/>
+          </w:tcPr>
+          <w:p>
+            <w:pPr>
+              <w:spacing w:after="0"/>
+            </w:pPr>
+            <w:r>
+              <w:t xml:space="preserve">Adverse rate</w:t>
+            </w:r>
+          </w:p>
+        </w:tc>
+      </w:tr>
+      <w:tr>
+        <w:tc>
+          <w:tcPr>
+            <w:tcW w:w="2340" w:type="dxa"/>
+          </w:tcPr>
+          <w:p>
+            <w:pPr>
+              <w:spacing w:after="0"/>
+            </w:pPr>
+            <w:r>
+              <w:t xml:space="preserve">Needs work or Gap (n = 9)</w:t>
+            </w:r>
+          </w:p>
+        </w:tc>
+        <w:tc>
+          <w:tcPr>
+            <w:tcW w:w="2340" w:type="dxa"/>
+          </w:tcPr>
+          <w:p>
+            <w:pPr>
+              <w:spacing w:after="0"/>
+            </w:pPr>
+            <w:r>
+              <w:t xml:space="preserve">7</w:t>
+            </w:r>
+          </w:p>
+        </w:tc>
+        <w:tc>
+          <w:tcPr>
+            <w:tcW w:w="2340" w:type="dxa"/>
+          </w:tcPr>
+          <w:p>
+            <w:pPr>
+              <w:spacing w:after="0"/>
+            </w:pPr>
+            <w:r>
+              <w:t xml:space="preserve">2</w:t>
+            </w:r>
+          </w:p>
+        </w:tc>
+        <w:tc>
+          <w:tcPr>
+            <w:tcW w:w="2340" w:type="dxa"/>
+          </w:tcPr>
+          <w:p>
+            <w:pPr>
+              <w:spacing w:after="0"/>
+            </w:pPr>
+            <w:r>
+              <w:t xml:space="preserve">77.8%</w:t>
+            </w:r>
+          </w:p>
+        </w:tc>
+      </w:tr>
+      <w:tr>
+        <w:tc>
+          <w:tcPr>
+            <w:tcW w:w="2340" w:type="dxa"/>
+          </w:tcPr>
+          <w:p>
+            <w:pPr>
+              <w:spacing w:after="0"/>
+            </w:pPr>
+            <w:r>
+              <w:t xml:space="preserve">Ready (n = 13)</w:t>
+            </w:r>
+          </w:p>
+        </w:tc>
+        <w:tc>
+          <w:tcPr>
+            <w:tcW w:w="2340" w:type="dxa"/>
+          </w:tcPr>
+          <w:p>
+            <w:pPr>
+              <w:spacing w:after="0"/>
+            </w:pPr>
+            <w:r>
+              <w:t xml:space="preserve">2</w:t>
+            </w:r>
+          </w:p>
+        </w:tc>
+        <w:tc>
+          <w:tcPr>
+            <w:tcW w:w="2340" w:type="dxa"/>
+          </w:tcPr>
+          <w:p>
+            <w:pPr>
+              <w:spacing w:after="0"/>
+            </w:pPr>
+            <w:r>
+              <w:t xml:space="preserve">11</w:t>
+            </w:r>
+          </w:p>
+        </w:tc>
+        <w:tc>
+          <w:tcPr>
+            <w:tcW w:w="2340" w:type="dxa"/>
+          </w:tcPr>
+          <w:p>
+            <w:pPr>
+              <w:spacing w:after="0"/>
+            </w:pPr>
+            <w:r>
+              <w:t xml:space="preserve">15.4%</w:t>
+            </w:r>
+          </w:p>
+        </w:tc>
+      </w:tr>
+    </w:tbl>
+    <w:p>
+      <w:pPr/>
+      <w:r>
+        <w:t/>
+      </w:r>
+    </w:p>
+    <w:p>
+      <w:pPr>
+        <w:spacing w:after="140"/>
       </w:pPr>
       <w:r>
         <w:t xml:space="preserve">Fisher's exact test, two-sided: </w:t>
@@ -501,7 +729,7 @@
     </w:p>
     <w:p>
       <w:pPr>
-        <w:spacing w:after="160" w:line="276" w:lineRule="auto"/>
+        <w:spacing w:after="140"/>
       </w:pPr>
       <w:r>
         <w:t xml:space="preserve">Records read as incomplete, before anyone knew how they resolved, went on to draw an adverse finding roughly five times as often as records that passed.</w:t>
@@ -509,7 +737,7 @@
     </w:p>
     <w:p>
       <w:pPr>
-        <w:spacing w:after="160" w:line="276" w:lineRule="auto"/>
+        <w:spacing w:after="140"/>
       </w:pPr>
       <w:r>
         <w:rPr>
@@ -523,7 +751,7 @@
     </w:p>
     <w:p>
       <w:pPr>
-        <w:spacing w:after="160" w:line="276" w:lineRule="auto"/>
+        <w:spacing w:after="140"/>
       </w:pPr>
       <w:r>
         <w:t xml:space="preserve">All three point the same way. Two of the three reach significance. </w:t>
@@ -540,7 +768,7 @@
     </w:p>
     <w:p>
       <w:pPr>
-        <w:spacing w:after="160" w:line="276" w:lineRule="auto"/>
+        <w:spacing w:after="140"/>
       </w:pPr>
       <w:r>
         <w:t xml:space="preserve">One record read as Gap was sustained anyway. It is kept in the count rather than dropped.</w:t>
@@ -549,7 +777,7 @@
     <w:p>
       <w:pPr>
         <w:pStyle w:val="Heading2"/>
-        <w:spacing w:before="360" w:after="120"/>
+        <w:spacing w:after="140"/>
       </w:pPr>
       <w:r>
         <w:t xml:space="preserve">Why the same review found nothing in a different corpus</w:t>
@@ -557,7 +785,7 @@
     </w:p>
     <w:p>
       <w:pPr>
-        <w:spacing w:after="160" w:line="276" w:lineRule="auto"/>
+        <w:spacing w:after="140"/>
       </w:pPr>
       <w:r>
         <w:t xml:space="preserve">The same review was applied by a different practitioner to 32 public-records determinations. In that corpus it did not track outcomes at all.</w:t>
@@ -565,7 +793,7 @@
     </w:p>
     <w:p>
       <w:pPr>
-        <w:spacing w:after="160" w:line="276" w:lineRule="auto"/>
+        <w:spacing w:after="140"/>
       </w:pPr>
       <w:r>
         <w:t xml:space="preserve">The reason is instructive for anyone designing a control test. Freedom-of-information determinations reach publication because a legal question was live, not because the file was thin. Fifteen of the 20 resolved determinations in that corpus did not survive, a rate set by the publication process rather than by how those agencies documented. The employment corpus is not filtered that way, and its outcomes are close to evenly split.</w:t>
@@ -573,7 +801,7 @@
     </w:p>
     <w:p>
       <w:pPr>
-        <w:spacing w:after="160" w:line="276" w:lineRule="auto"/>
+        <w:spacing w:after="140"/>
       </w:pPr>
       <w:r>
         <w:t xml:space="preserve">A formal test of homogeneity shows the two results do not differ significantly from each other.&lt;sup&gt;2&lt;/sup&gt; </w:t>
@@ -591,7 +819,7 @@
     <w:p>
       <w:pPr>
         <w:pStyle w:val="Heading2"/>
-        <w:spacing w:before="360" w:after="120"/>
+        <w:spacing w:after="140"/>
       </w:pPr>
       <w:r>
         <w:t xml:space="preserve">What this looks like in an examination</w:t>
@@ -599,7 +827,7 @@
     </w:p>
     <w:p>
       <w:pPr>
-        <w:spacing w:after="160" w:line="276" w:lineRule="auto"/>
+        <w:spacing w:after="140"/>
       </w:pPr>
       <w:r>
         <w:t xml:space="preserve">Internal audit and financial-crime work test records the way litigation does, only sooner and more often. An examiner reads the file and asks whether its stated basis can be rebuilt from the record itself. That is the same question the review asks, put before the examiner arrives rather than after.</w:t>
@@ -607,7 +835,7 @@
     </w:p>
     <w:p>
       <w:pPr>
-        <w:spacing w:after="160" w:line="276" w:lineRule="auto"/>
+        <w:spacing w:after="140"/>
       </w:pPr>
       <w:r>
         <w:t xml:space="preserve">Three failure patterns recur, and each maps to a specific way AI-assisted drafting introduces the risk. </w:t>
@@ -616,12 +844,12 @@
         <w:rPr>
           <w:b/>
         </w:rPr>
-        <w:t xml:space="preserve">They are described here as general patterns in audit and investigations practice. They are not drawn from, and do not describe, the records or examinations of any identified organisation.</w:t>
-      </w:r>
-    </w:p>
-    <w:p>
-      <w:pPr>
-        <w:spacing w:after="160" w:line="276" w:lineRule="auto"/>
+        <w:t xml:space="preserve">They are described here as general patterns in audit and investigations practice. They are not drawn from, and do not describe, any client engagement, examination, or the records of any organisation.</w:t>
+      </w:r>
+    </w:p>
+    <w:p>
+      <w:pPr>
+        <w:spacing w:after="140"/>
       </w:pPr>
       <w:r>
         <w:rPr>
@@ -635,7 +863,7 @@
     </w:p>
     <w:p>
       <w:pPr>
-        <w:spacing w:after="160" w:line="276" w:lineRule="auto"/>
+        <w:spacing w:after="140"/>
       </w:pPr>
       <w:r>
         <w:rPr>
@@ -649,7 +877,7 @@
     </w:p>
     <w:p>
       <w:pPr>
-        <w:spacing w:after="160" w:line="276" w:lineRule="auto"/>
+        <w:spacing w:after="140"/>
       </w:pPr>
       <w:r>
         <w:rPr>
@@ -663,7 +891,7 @@
     </w:p>
     <w:p>
       <w:pPr>
-        <w:spacing w:after="160" w:line="276" w:lineRule="auto"/>
+        <w:spacing w:after="140"/>
       </w:pPr>
       <w:r>
         <w:t xml:space="preserve">In audit terms the review functions as a record-level control test with a testable pass condition. A file that fails it is not necessarily a wrong decision. It is an exposure, and it is one that can be found and remediated inside the workflow rather than in a deposition. That is what makes documentation quality usable as a first-line and second-line check rather than a matter of style.</w:t>
@@ -672,7 +900,7 @@
     <w:p>
       <w:pPr>
         <w:pStyle w:val="Heading2"/>
-        <w:spacing w:before="360" w:after="120"/>
+        <w:spacing w:after="140"/>
       </w:pPr>
       <w:r>
         <w:t xml:space="preserve">A control set that fits inside existing workflows</w:t>
@@ -680,7 +908,7 @@
     </w:p>
     <w:p>
       <w:pPr>
-        <w:spacing w:after="160" w:line="276" w:lineRule="auto"/>
+        <w:spacing w:after="140"/>
       </w:pPr>
       <w:r>
         <w:t xml:space="preserve">Four controls, applied before a record enters the system of record:</w:t>
@@ -688,13 +916,13 @@
     </w:p>
     <w:p>
       <w:pPr>
-        <w:ind w:left="360" w:hanging="360"/>
+        <w:numPr>
+          <w:ilvl w:val="0"/>
+          <w:numId w:val="2"/>
+        </w:numPr>
         <w:spacing w:after="60"/>
       </w:pPr>
       <w:r>
-        <w:t xml:space="preserve">1. </w:t>
-      </w:r>
-      <w:r>
         <w:rPr>
           <w:b/>
         </w:rPr>
@@ -706,13 +934,13 @@
     </w:p>
     <w:p>
       <w:pPr>
-        <w:ind w:left="360" w:hanging="360"/>
+        <w:numPr>
+          <w:ilvl w:val="0"/>
+          <w:numId w:val="2"/>
+        </w:numPr>
         <w:spacing w:after="60"/>
       </w:pPr>
       <w:r>
-        <w:t xml:space="preserve">2. </w:t>
-      </w:r>
-      <w:r>
         <w:rPr>
           <w:b/>
         </w:rPr>
@@ -724,13 +952,13 @@
     </w:p>
     <w:p>
       <w:pPr>
-        <w:ind w:left="360" w:hanging="360"/>
+        <w:numPr>
+          <w:ilvl w:val="0"/>
+          <w:numId w:val="2"/>
+        </w:numPr>
         <w:spacing w:after="60"/>
       </w:pPr>
       <w:r>
-        <w:t xml:space="preserve">3. </w:t>
-      </w:r>
-      <w:r>
         <w:rPr>
           <w:b/>
         </w:rPr>
@@ -742,13 +970,13 @@
     </w:p>
     <w:p>
       <w:pPr>
-        <w:ind w:left="360" w:hanging="360"/>
+        <w:numPr>
+          <w:ilvl w:val="0"/>
+          <w:numId w:val="2"/>
+        </w:numPr>
         <w:spacing w:after="60"/>
       </w:pPr>
       <w:r>
-        <w:t xml:space="preserve">4. </w:t>
-      </w:r>
-      <w:r>
         <w:rPr>
           <w:b/>
         </w:rPr>
@@ -760,7 +988,7 @@
     </w:p>
     <w:p>
       <w:pPr>
-        <w:spacing w:after="160" w:line="276" w:lineRule="auto"/>
+        <w:spacing w:after="140"/>
       </w:pPr>
       <w:r>
         <w:t xml:space="preserve">Three indicators make the set measurable on a sample, flag and remediate cadence: the percentage of claims supported by documented evidence, the rate of claims lacking documentation, and the frequency of subjective language across files and authors. These behave as early-warning signals of legal and compliance exposure rather than as a documentation-tidiness score.</w:t>
@@ -769,7 +997,7 @@
     <w:p>
       <w:pPr>
         <w:pStyle w:val="Heading2"/>
-        <w:spacing w:before="360" w:after="120"/>
+        <w:spacing w:after="140"/>
       </w:pPr>
       <w:r>
         <w:t xml:space="preserve">Running it as a control rather than a project</w:t>
@@ -777,7 +1005,7 @@
     </w:p>
     <w:p>
       <w:pPr>
-        <w:spacing w:after="160" w:line="276" w:lineRule="auto"/>
+        <w:spacing w:after="140"/>
       </w:pPr>
       <w:r>
         <w:t xml:space="preserve">Three practical questions come up whenever this is proposed as an ongoing control.</w:t>
@@ -785,7 +1013,7 @@
     </w:p>
     <w:p>
       <w:pPr>
-        <w:spacing w:after="160" w:line="276" w:lineRule="auto"/>
+        <w:spacing w:after="140"/>
       </w:pPr>
       <w:r>
         <w:rPr>
@@ -794,52 +1022,92 @@
         <w:t xml:space="preserve">Where does it sit in three lines of defence?</w:t>
       </w:r>
       <w:r>
-        <w:t xml:space="preserve"> It works at the first line as a</w:t>
-      </w:r>
-    </w:p>
-    <w:p>
-      <w:pPr>
-        <w:spacing w:after="160" w:line="276" w:lineRule="auto"/>
-      </w:pPr>
-      <w:r>
-        <w:t xml:space="preserve">pre-finalisation self-check by the drafter, and at the second line as a sampling control by</w:t>
-      </w:r>
-    </w:p>
-    <w:p>
-      <w:pPr>
-        <w:spacing w:after="160" w:line="276" w:lineRule="auto"/>
-      </w:pPr>
-      <w:r>
-        <w:t xml:space="preserve">compliance or risk. It is not a third-line activity: by the time internal audit is reading</w:t>
-      </w:r>
-    </w:p>
-    <w:p>
-      <w:pPr>
-        <w:spacing w:after="160" w:line="276" w:lineRule="auto"/>
-      </w:pPr>
-      <w:r>
-        <w:t xml:space="preserve">the population, the records are already in the system of record and the remediation window</w:t>
-      </w:r>
-    </w:p>
-    <w:p>
-      <w:pPr>
-        <w:spacing w:after="160" w:line="276" w:lineRule="auto"/>
-      </w:pPr>
-      <w:r>
-        <w:t xml:space="preserve">has closed. The value of the review is that it is cheap to apply before finalisation and</w:t>
-      </w:r>
-    </w:p>
-    <w:p>
-      <w:pPr>
-        <w:spacing w:after="160" w:line="276" w:lineRule="auto"/>
-      </w:pPr>
-      <w:r>
-        <w:t xml:space="preserve">expensive to apply afterwards.</w:t>
-      </w:r>
-    </w:p>
-    <w:p>
-      <w:pPr>
-        <w:spacing w:after="160" w:line="276" w:lineRule="auto"/>
+        <w:t xml:space="preserve"> The review is cheapest to apply before a</w:t>
+      </w:r>
+    </w:p>
+    <w:p>
+      <w:pPr>
+        <w:spacing w:after="140"/>
+      </w:pPr>
+      <w:r>
+        <w:t xml:space="preserve">record is finalised and most expensive afterwards, so its preventive value sits at the first</w:t>
+      </w:r>
+    </w:p>
+    <w:p>
+      <w:pPr>
+        <w:spacing w:after="140"/>
+      </w:pPr>
+      <w:r>
+        <w:t xml:space="preserve">line as a self-check by the drafter and at the second line as a sampling control by</w:t>
+      </w:r>
+    </w:p>
+    <w:p>
+      <w:pPr>
+        <w:spacing w:after="140"/>
+      </w:pPr>
+      <w:r>
+        <w:t xml:space="preserve">compliance or risk.</w:t>
+      </w:r>
+    </w:p>
+    <w:p>
+      <w:pPr>
+        <w:spacing w:after="140"/>
+      </w:pPr>
+      <w:r>
+        <w:t xml:space="preserve">**That is not an argument that internal audit has no role, and the third line arguably has</w:t>
+      </w:r>
+    </w:p>
+    <w:p>
+      <w:pPr>
+        <w:spacing w:after="140"/>
+      </w:pPr>
+      <w:r>
+        <w:t xml:space="preserve">the most useful one.** Applied to a population of closed files, the same five conditions</w:t>
+      </w:r>
+    </w:p>
+    <w:p>
+      <w:pPr>
+        <w:spacing w:after="140"/>
+      </w:pPr>
+      <w:r>
+        <w:t xml:space="preserve">yield a measured rate of records that cannot carry their own reasoning, broken out by</w:t>
+      </w:r>
+    </w:p>
+    <w:p>
+      <w:pPr>
+        <w:spacing w:after="140"/>
+      </w:pPr>
+      <w:r>
+        <w:t xml:space="preserve">decision type and business unit. That is a finding about the control environment rather than</w:t>
+      </w:r>
+    </w:p>
+    <w:p>
+      <w:pPr>
+        <w:spacing w:after="140"/>
+      </w:pPr>
+      <w:r>
+        <w:t xml:space="preserve">any individual file, and it is what justifies putting a preventive check in place at all.</w:t>
+      </w:r>
+    </w:p>
+    <w:p>
+      <w:pPr>
+        <w:spacing w:after="140"/>
+      </w:pPr>
+      <w:r>
+        <w:t xml:space="preserve">**Third-line application is diagnostic, first and second-line application is preventive, and</w:t>
+      </w:r>
+    </w:p>
+    <w:p>
+      <w:pPr>
+        <w:spacing w:after="140"/>
+      </w:pPr>
+      <w:r>
+        <w:t xml:space="preserve">the diagnosis usually comes first.**</w:t>
+      </w:r>
+    </w:p>
+    <w:p>
+      <w:pPr>
+        <w:spacing w:after="140"/>
       </w:pPr>
       <w:r>
         <w:rPr>
@@ -848,20 +1116,70 @@
         <w:t xml:space="preserve">What sample size?</w:t>
       </w:r>
       <w:r>
-        <w:t xml:space="preserve"> The unit of analysis is the record, and the signal in this study</w:t>
-      </w:r>
-    </w:p>
-    <w:p>
-      <w:pPr>
-        <w:spacing w:after="160" w:line="276" w:lineRule="auto"/>
-      </w:pPr>
-      <w:r>
-        <w:t xml:space="preserve">appeared at 22. For a periodic control, a monthly sample sized to the population and</w:t>
-      </w:r>
-    </w:p>
-    <w:p>
-      <w:pPr>
-        <w:spacing w:after="160" w:line="276" w:lineRule="auto"/>
+        <w:t xml:space="preserve"> </w:t>
+      </w:r>
+      <w:r>
+        <w:rPr>
+          <w:b/>
+        </w:rPr>
+        <w:t xml:space="preserve">Not 22, and this study cannot derive one.</w:t>
+      </w:r>
+      <w:r>
+        <w:t xml:space="preserve"> Twenty-two was the entire</w:t>
+      </w:r>
+    </w:p>
+    <w:p>
+      <w:pPr>
+        <w:spacing w:after="140"/>
+      </w:pPr>
+      <w:r>
+        <w:t xml:space="preserve">corpus, not a sample drawn from a defined population against a stated tolerable error and</w:t>
+      </w:r>
+    </w:p>
+    <w:p>
+      <w:pPr>
+        <w:spacing w:after="140"/>
+      </w:pPr>
+      <w:r>
+        <w:t xml:space="preserve">confidence level, so it supports no inference about how many records a periodic control</w:t>
+      </w:r>
+    </w:p>
+    <w:p>
+      <w:pPr>
+        <w:spacing w:after="140"/>
+      </w:pPr>
+      <w:r>
+        <w:t xml:space="preserve">should examine. </w:t>
+      </w:r>
+      <w:r>
+        <w:rPr>
+          <w:b/>
+        </w:rPr>
+        <w:t xml:space="preserve">Build the sampling plan the ordinary way</w:t>
+      </w:r>
+      <w:r>
+        <w:t xml:space="preserve">, from the population of</w:t>
+      </w:r>
+    </w:p>
+    <w:p>
+      <w:pPr>
+        <w:spacing w:after="140"/>
+      </w:pPr>
+      <w:r>
+        <w:t xml:space="preserve">consequential decisions in scope, using whatever sampling standard the function already</w:t>
+      </w:r>
+    </w:p>
+    <w:p>
+      <w:pPr>
+        <w:spacing w:after="140"/>
+      </w:pPr>
+      <w:r>
+        <w:t xml:space="preserve">applies. The unit of analysis is the record. For a periodic control, a monthly sample sized to the population and</w:t>
+      </w:r>
+    </w:p>
+    <w:p>
+      <w:pPr>
+        <w:spacing w:after="140"/>
       </w:pPr>
       <w:r>
         <w:t xml:space="preserve">weighted toward consequential decisions, terminations, disciplinary outcomes, denials of</w:t>
@@ -869,7 +1187,7 @@
     </w:p>
     <w:p>
       <w:pPr>
-        <w:spacing w:after="160" w:line="276" w:lineRule="auto"/>
+        <w:spacing w:after="140"/>
       </w:pPr>
       <w:r>
         <w:t xml:space="preserve">accommodation, will surface the pattern faster than a larger unweighted sample. The</w:t>
@@ -877,7 +1195,7 @@
     </w:p>
     <w:p>
       <w:pPr>
-        <w:spacing w:after="160" w:line="276" w:lineRule="auto"/>
+        <w:spacing w:after="140"/>
       </w:pPr>
       <w:r>
         <w:t xml:space="preserve">aggregate view matters more than any individual file, because compliance washing is only</w:t>
@@ -885,7 +1203,7 @@
     </w:p>
     <w:p>
       <w:pPr>
-        <w:spacing w:after="160" w:line="276" w:lineRule="auto"/>
+        <w:spacing w:after="140"/>
       </w:pPr>
       <w:r>
         <w:t xml:space="preserve">visible across a population.</w:t>
@@ -893,7 +1211,7 @@
     </w:p>
     <w:p>
       <w:pPr>
-        <w:spacing w:after="160" w:line="276" w:lineRule="auto"/>
+        <w:spacing w:after="140"/>
       </w:pPr>
       <w:r>
         <w:rPr>
@@ -907,7 +1225,7 @@
     </w:p>
     <w:p>
       <w:pPr>
-        <w:spacing w:after="160" w:line="276" w:lineRule="auto"/>
+        <w:spacing w:after="140"/>
       </w:pPr>
       <w:r>
         <w:t xml:space="preserve">A rate of Needs work reads that is rising, or that clusters by author, business unit or</w:t>
@@ -915,7 +1233,7 @@
     </w:p>
     <w:p>
       <w:pPr>
-        <w:spacing w:after="160" w:line="276" w:lineRule="auto"/>
+        <w:spacing w:after="140"/>
       </w:pPr>
       <w:r>
         <w:t xml:space="preserve">subject, is a control finding. The second is the reportable event, and it is invisible</w:t>
@@ -923,7 +1241,7 @@
     </w:p>
     <w:p>
       <w:pPr>
-        <w:spacing w:after="160" w:line="276" w:lineRule="auto"/>
+        <w:spacing w:after="140"/>
       </w:pPr>
       <w:r>
         <w:t xml:space="preserve">without the first being recorded consistently.</w:t>
@@ -931,7 +1249,7 @@
     </w:p>
     <w:p>
       <w:pPr>
-        <w:spacing w:after="160" w:line="276" w:lineRule="auto"/>
+        <w:spacing w:after="140"/>
       </w:pPr>
       <w:r>
         <w:rPr>
@@ -945,7 +1263,7 @@
     </w:p>
     <w:p>
       <w:pPr>
-        <w:spacing w:after="160" w:line="276" w:lineRule="auto"/>
+        <w:spacing w:after="140"/>
       </w:pPr>
       <w:r>
         <w:t xml:space="preserve">worth less than one applied by somebody else, for the same reason a self-assessment is worth</w:t>
@@ -953,7 +1271,7 @@
     </w:p>
     <w:p>
       <w:pPr>
-        <w:spacing w:after="160" w:line="276" w:lineRule="auto"/>
+        <w:spacing w:after="140"/>
       </w:pPr>
       <w:r>
         <w:t xml:space="preserve">less than an inspection. Where the review is used at the first line, treat it as a drafting</w:t>
@@ -961,7 +1279,7 @@
     </w:p>
     <w:p>
       <w:pPr>
-        <w:spacing w:after="160" w:line="276" w:lineRule="auto"/>
+        <w:spacing w:after="140"/>
       </w:pPr>
       <w:r>
         <w:t xml:space="preserve">discipline rather than as assurance, and keep the second-line sample independent of the</w:t>
@@ -969,7 +1287,7 @@
     </w:p>
     <w:p>
       <w:pPr>
-        <w:spacing w:after="160" w:line="276" w:lineRule="auto"/>
+        <w:spacing w:after="140"/>
       </w:pPr>
       <w:r>
         <w:t xml:space="preserve">drafters.</w:t>
@@ -978,7 +1296,7 @@
     <w:p>
       <w:pPr>
         <w:pStyle w:val="Heading2"/>
-        <w:spacing w:before="360" w:after="120"/>
+        <w:spacing w:after="140"/>
       </w:pPr>
       <w:r>
         <w:t xml:space="preserve">What this establishes, and what it does not</w:t>
@@ -986,7 +1304,7 @@
     </w:p>
     <w:p>
       <w:pPr>
-        <w:spacing w:after="160" w:line="276" w:lineRule="auto"/>
+        <w:spacing w:after="140"/>
       </w:pPr>
       <w:r>
         <w:t xml:space="preserve">It establishes that an effect of this size is visible at practitioner scale, in real adjudicated matters, using a review a working specialist can apply inside an ordinary workload.</w:t>
@@ -994,7 +1312,7 @@
     </w:p>
     <w:p>
       <w:pPr>
-        <w:spacing w:after="160" w:line="276" w:lineRule="auto"/>
+        <w:spacing w:after="140"/>
       </w:pPr>
       <w:r>
         <w:t xml:space="preserve">It does not establish that the review improves outcomes, reduces litigation risk or increases decision quality. None of those was tested. Twenty-two cases from one practitioner's caseload, selected from published sources rather than sampled at random, is a field pilot and is reported as one. Published adjudications are not a random sample of employment records: a matter reaches adjudication because something was contested.</w:t>
@@ -1002,7 +1320,7 @@
     </w:p>
     <w:p>
       <w:pPr>
-        <w:spacing w:after="160" w:line="276" w:lineRule="auto"/>
+        <w:spacing w:after="140"/>
       </w:pPr>
       <w:r>
         <w:t xml:space="preserve">A larger study should broaden the corpus without regard to how matters resolved, put at least two reviewers on each case with the review and the outcome recorded separately, and fix the treatment of unresolved contests in advance.</w:t>
@@ -1010,7 +1328,7 @@
     </w:p>
     <w:p>
       <w:pPr>
-        <w:spacing w:after="160" w:line="276" w:lineRule="auto"/>
+        <w:spacing w:after="140"/>
       </w:pPr>
       <w:r>
         <w:t xml:space="preserve">The drafting tool is new. The examiner's question is not: the file still has to account for itself.</w:t>
@@ -1019,7 +1337,7 @@
     <w:p>
       <w:pPr>
         <w:pStyle w:val="Heading2"/>
-        <w:spacing w:before="360" w:after="120"/>
+        <w:spacing w:after="140"/>
       </w:pPr>
       <w:r>
         <w:t xml:space="preserve">Endnotes</w:t>
@@ -1027,59 +1345,74 @@
     </w:p>
     <w:p>
       <w:pPr>
-        <w:ind w:left="360" w:hanging="360"/>
+        <w:numPr>
+          <w:ilvl w:val="0"/>
+          <w:numId w:val="2"/>
+        </w:numPr>
         <w:spacing w:after="60"/>
       </w:pPr>
       <w:r>
-        <w:t xml:space="preserve">1. Fisher's exact test, two-sided, on the 2 x 2 table shown. Odds ratio 19.25. Ninety-five percent Wilson score intervals: 45.3 to 93.7 percent for the flagged group, 4.3 to 42.2 percent for the group read as Ready. Wilson intervals are used because the cell counts are small.</w:t>
-      </w:r>
-    </w:p>
-    <w:p>
-      <w:pPr>
-        <w:ind w:left="360" w:hanging="360"/>
+        <w:t xml:space="preserve">Fisher's exact test, two-sided, on the 2 x 2 table shown. Odds ratio 19.25. Ninety-five percent Wilson score intervals: 45.3 to 93.7 percent for the flagged group, 4.3 to 42.2 percent for the group read as Ready. Wilson intervals are used because the cell counts are small.</w:t>
+      </w:r>
+    </w:p>
+    <w:p>
+      <w:pPr>
+        <w:numPr>
+          <w:ilvl w:val="0"/>
+          <w:numId w:val="2"/>
+        </w:numPr>
         <w:spacing w:after="60"/>
       </w:pPr>
       <w:r>
-        <w:t xml:space="preserve">2. Woolf test of homogeneity on the two corpora's log odds ratios: Q = 2.550 on 1 degree of freedom, p = 0.110.</w:t>
-      </w:r>
-    </w:p>
-    <w:p>
-      <w:pPr>
-        <w:ind w:left="360" w:hanging="360"/>
+        <w:t xml:space="preserve">Woolf test of homogeneity on the two corpora's log odds ratios: Q = 2.550 on 1 degree of freedom, p = 0.110.</w:t>
+      </w:r>
+    </w:p>
+    <w:p>
+      <w:pPr>
+        <w:numPr>
+          <w:ilvl w:val="0"/>
+          <w:numId w:val="2"/>
+        </w:numPr>
         <w:spacing w:after="60"/>
       </w:pPr>
       <w:r>
-        <w:t xml:space="preserve">3. Case counts, reads and outcomes were verified against the study database on 21 August 2026. The database records one timestamp per case rather than separate review and outcome times, so the recorded sequence rests on the study protocol rather than on a system record. A larger study should timestamp the two steps separately.</w:t>
-      </w:r>
-    </w:p>
-    <w:p>
-      <w:pPr>
-        <w:ind w:left="360" w:hanging="360"/>
+        <w:t xml:space="preserve">Case counts, reads and outcomes were verified against the study database on 21 August 2026. The database records one timestamp per case rather than separate review and outcome times, so the recorded sequence rests on the study protocol rather than on a system record. A larger study should timestamp the two steps separately.</w:t>
+      </w:r>
+    </w:p>
+    <w:p>
+      <w:pPr>
+        <w:numPr>
+          <w:ilvl w:val="0"/>
+          <w:numId w:val="2"/>
+        </w:numPr>
         <w:spacing w:after="60"/>
       </w:pPr>
       <w:r>
-        <w:t xml:space="preserve">4. The validation methodology behind this work, including the reference-panel design, the chance-corrected agreement framework and the acceptance thresholds fixed in advance of analysis, is the contribution of Ubayet Hossain, FRM, Associate Director, Model Validation, KPMG India.</w:t>
-      </w:r>
-    </w:p>
-    <w:p>
-      <w:pPr>
-        <w:ind w:left="360" w:hanging="360"/>
+        <w:t xml:space="preserve">The validation methodology behind this work, including the reference-panel design, the chance-corrected agreement framework and the acceptance thresholds fixed in advance of analysis, is the contribution of Ubayet Hossain, FRM, Associate Director, Model Validation, KPMG India.</w:t>
+      </w:r>
+    </w:p>
+    <w:p>
+      <w:pPr>
+        <w:numPr>
+          <w:ilvl w:val="0"/>
+          <w:numId w:val="2"/>
+        </w:numPr>
         <w:spacing w:after="60"/>
       </w:pPr>
       <w:r>
-        <w:t xml:space="preserve">5. Phillip Wikes developed the review method described here and would benefit from its adoption. He read no case in this corpus and recorded no read and no outcome. He specified and ran the analyses reported in this article.</w:t>
+        <w:t xml:space="preserve">Phillip Wikes developed the review method described here and would benefit from its adoption. He read no case in this corpus and recorded no read and no outcome. He specified and ran the analyses reported in this article.</w:t>
       </w:r>
     </w:p>
     <w:p>
       <w:pPr>
         <w:pBdr>
-          <w:bottom w:val="single" w:sz="6" w:space="1" w:color="BFBFBF"/>
+          <w:bottom w:val="single" w:sz="6" w:space="1" w:color="AAAAAA"/>
         </w:pBdr>
       </w:pPr>
     </w:p>
     <w:p>
       <w:pPr>
-        <w:spacing w:after="160" w:line="276" w:lineRule="auto"/>
+        <w:spacing w:after="140"/>
       </w:pPr>
       <w:r>
         <w:rPr>
@@ -1088,26 +1421,12 @@
         <w:t xml:space="preserve">Tanvi Pokhriyal</w:t>
       </w:r>
       <w:r>
-        <w:t xml:space="preserve"> is a Human Resources Manager at REIL Innovative Solutions, working in employment and industrial relations. She designed the case protocol for this study and conducted every record review reported in it.</w:t>
-      </w:r>
-    </w:p>
-    <w:p>
-      <w:pPr>
-        <w:spacing w:after="160" w:line="276" w:lineRule="auto"/>
-      </w:pPr>
-      <w:r>
-        <w:rPr>
-          <w:b/>
-        </w:rPr>
-        <w:t xml:space="preserve">Kyle McMullan</w:t>
-      </w:r>
-      <w:r>
-        <w:t xml:space="preserve"> is a Chief Audit Executive working in internal audit and financial crime.</w:t>
-      </w:r>
-    </w:p>
-    <w:p>
-      <w:pPr>
-        <w:spacing w:after="160" w:line="276" w:lineRule="auto"/>
+        <w:t xml:space="preserve"> is an Organisational Psychologist working freelance. She is an HR and organisational psychology professional with over 15 years of experience across human resources, organisational development, business development, and marketing, including experience within the oil and gas sector. Her professional interests include organisational behaviour, employee relations, workplace decision-making, people management, and the evolving role of technology. She designed the case protocol for this study and conducted every record review reported in it.</w:t>
+      </w:r>
+    </w:p>
+    <w:p>
+      <w:pPr>
+        <w:spacing w:after="140"/>
       </w:pPr>
       <w:r>
         <w:rPr>
@@ -1117,6 +1436,146 @@
       </w:r>
       <w:r>
         <w:t xml:space="preserve"> is an AI Governance and Cognitive Risk Advisor focused on documentation integrity and record-level controls in AI-assisted environments. He served as a Lead Civil Rights Officer at the Maryland Commission on Civil Rights, evaluating discrimination complaints under federal HUD and EEOC frameworks. He developed the Justification Review Standard and named Decision Reconstruction Risk.</w:t>
+      </w:r>
+    </w:p>
+    <w:p>
+      <w:pPr>
+        <w:pBdr>
+          <w:bottom w:val="single" w:sz="6" w:space="1" w:color="AAAAAA"/>
+        </w:pBdr>
+      </w:pPr>
+    </w:p>
+    <w:p>
+      <w:pPr>
+        <w:pStyle w:val="Heading2"/>
+        <w:spacing w:after="140"/>
+      </w:pPr>
+      <w:r>
+        <w:t xml:space="preserve">Acknowledgement</w:t>
+      </w:r>
+    </w:p>
+    <w:p>
+      <w:pPr>
+        <w:spacing w:after="140"/>
+      </w:pPr>
+      <w:r>
+        <w:t xml:space="preserve">The author thanks Kyle McMullan for comments on audit practice. He did not review the study</w:t>
+      </w:r>
+    </w:p>
+    <w:p>
+      <w:pPr>
+        <w:spacing w:after="140"/>
+      </w:pPr>
+      <w:r>
+        <w:t xml:space="preserve">and does not endorse its findings.</w:t>
+      </w:r>
+    </w:p>
+    <w:p>
+      <w:pPr>
+        <w:pBdr>
+          <w:bottom w:val="single" w:sz="6" w:space="1" w:color="AAAAAA"/>
+        </w:pBdr>
+      </w:pPr>
+    </w:p>
+    <w:p>
+      <w:pPr>
+        <w:pStyle w:val="Heading2"/>
+        <w:spacing w:after="140"/>
+      </w:pPr>
+      <w:r>
+        <w:t xml:space="preserve">Declarations</w:t>
+      </w:r>
+    </w:p>
+    <w:p>
+      <w:pPr>
+        <w:spacing w:after="140"/>
+      </w:pPr>
+      <w:r>
+        <w:rPr>
+          <w:b/>
+        </w:rPr>
+        <w:t xml:space="preserve">Financial interests.</w:t>
+      </w:r>
+      <w:r>
+        <w:t xml:space="preserve"> Tanvi Pokhriyal declares that she has no financial or commercial</w:t>
+      </w:r>
+    </w:p>
+    <w:p>
+      <w:pPr>
+        <w:spacing w:after="140"/>
+      </w:pPr>
+      <w:r>
+        <w:t xml:space="preserve">interest, ownership, investment, or other financial relationship that could influence or be</w:t>
+      </w:r>
+    </w:p>
+    <w:p>
+      <w:pPr>
+        <w:spacing w:after="140"/>
+      </w:pPr>
+      <w:r>
+        <w:t xml:space="preserve">perceived to influence the findings, interpretation, or conclusions of this research.</w:t>
+      </w:r>
+    </w:p>
+    <w:p>
+      <w:pPr>
+        <w:spacing w:after="140"/>
+      </w:pPr>
+      <w:r>
+        <w:t xml:space="preserve">Phillip Wikes developed the review method described here and would benefit from its</w:t>
+      </w:r>
+    </w:p>
+    <w:p>
+      <w:pPr>
+        <w:spacing w:after="140"/>
+      </w:pPr>
+      <w:r>
+        <w:t xml:space="preserve">adoption; that interest is set out in endnote 5.</w:t>
+      </w:r>
+    </w:p>
+    <w:p>
+      <w:pPr>
+        <w:spacing w:after="140"/>
+      </w:pPr>
+      <w:r>
+        <w:rPr>
+          <w:b/>
+        </w:rPr>
+        <w:t xml:space="preserve">Research funding.</w:t>
+      </w:r>
+      <w:r>
+        <w:t xml:space="preserve"> Tanvi Pokhriyal declares that this research was conducted without any</w:t>
+      </w:r>
+    </w:p>
+    <w:p>
+      <w:pPr>
+        <w:spacing w:after="140"/>
+      </w:pPr>
+      <w:r>
+        <w:t xml:space="preserve">external financial support or research funding, and that she has not received, directly or</w:t>
+      </w:r>
+    </w:p>
+    <w:p>
+      <w:pPr>
+        <w:spacing w:after="140"/>
+      </w:pPr>
+      <w:r>
+        <w:t xml:space="preserve">indirectly, any funding, sponsorship, grants, or commercial financial assistance for the</w:t>
+      </w:r>
+    </w:p>
+    <w:p>
+      <w:pPr>
+        <w:spacing w:after="140"/>
+      </w:pPr>
+      <w:r>
+        <w:t xml:space="preserve">preparation or completion of this research paper. No external funding was received by any</w:t>
+      </w:r>
+    </w:p>
+    <w:p>
+      <w:pPr>
+        <w:spacing w:after="140"/>
+      </w:pPr>
+      <w:r>
+        <w:t xml:space="preserve">author.</w:t>
       </w:r>
     </w:p>
     <w:sectPr>
@@ -1127,38 +1586,98 @@
 </w:document>
 </file>
 
+<file path=word/numbering.xml><?xml version="1.0" encoding="utf-8"?>
+<w:numbering xmlns:w="http://schemas.openxmlformats.org/wordprocessingml/2006/main">
+  <w:abstractNum w:abstractNumId="0">
+    <w:lvl w:ilvl="0">
+      <w:numFmt w:val="bullet"/>
+      <w:lvlText w:val="•"/>
+      <w:pPr>
+        <w:ind w:left="720" w:hanging="360"/>
+      </w:pPr>
+    </w:lvl>
+  </w:abstractNum>
+  <w:abstractNum w:abstractNumId="1">
+    <w:lvl w:ilvl="0">
+      <w:start w:val="1"/>
+      <w:numFmt w:val="decimal"/>
+      <w:lvlText w:val="%1."/>
+      <w:pPr>
+        <w:ind w:left="720" w:hanging="360"/>
+      </w:pPr>
+    </w:lvl>
+  </w:abstractNum>
+  <w:num w:numId="1">
+    <w:abstractNumId w:val="0"/>
+  </w:num>
+  <w:num w:numId="2">
+    <w:abstractNumId w:val="1"/>
+  </w:num>
+</w:numbering>
+</file>
+
 <file path=word/styles.xml><?xml version="1.0" encoding="utf-8"?>
 <w:styles xmlns:w="http://schemas.openxmlformats.org/wordprocessingml/2006/main">
   <w:docDefaults>
     <w:rPrDefault>
       <w:rPr>
-        <w:rFonts w:ascii="Georgia" w:hAnsi="Georgia"/>
-        <w:sz w:val="22"/>
+        <w:rFonts w:ascii="Times New Roman" w:hAnsi="Times New Roman"/>
+        <w:sz w:val="24"/>
       </w:rPr>
     </w:rPrDefault>
   </w:docDefaults>
+  <w:style w:type="paragraph" w:styleId="Normal" w:default="1">
+    <w:name w:val="Normal"/>
+  </w:style>
   <w:style w:type="paragraph" w:styleId="Heading1">
     <w:name w:val="heading 1"/>
+    <w:basedOn w:val="Normal"/>
+    <w:pPr>
+      <w:outlineLvl w:val="0"/>
+      <w:spacing w:before="240" w:after="120"/>
+    </w:pPr>
     <w:rPr>
-      <w:rFonts w:ascii="Georgia" w:hAnsi="Georgia"/>
       <w:b/>
-      <w:sz w:val="34"/>
+      <w:sz w:val="36"/>
     </w:rPr>
   </w:style>
   <w:style w:type="paragraph" w:styleId="Heading2">
     <w:name w:val="heading 2"/>
+    <w:basedOn w:val="Normal"/>
+    <w:pPr>
+      <w:outlineLvl w:val="1"/>
+      <w:spacing w:before="220" w:after="110"/>
+    </w:pPr>
     <w:rPr>
-      <w:rFonts w:ascii="Georgia" w:hAnsi="Georgia"/>
+      <w:b/>
+      <w:sz w:val="28"/>
+    </w:rPr>
+  </w:style>
+  <w:style w:type="paragraph" w:styleId="Heading3">
+    <w:name w:val="heading 3"/>
+    <w:basedOn w:val="Normal"/>
+    <w:pPr>
+      <w:outlineLvl w:val="2"/>
+      <w:spacing w:before="200" w:after="100"/>
+    </w:pPr>
+    <w:rPr>
       <w:b/>
       <w:sz w:val="26"/>
     </w:rPr>
   </w:style>
-  <w:style w:type="character" w:styleId="Hyperlink">
-    <w:name w:val="Hyperlink"/>
+  <w:style w:type="paragraph" w:styleId="Heading4">
+    <w:name w:val="heading 4"/>
+    <w:basedOn w:val="Normal"/>
+    <w:pPr>
+      <w:outlineLvl w:val="3"/>
+    </w:pPr>
     <w:rPr>
-      <w:color w:val="0563C1"/>
-      <w:u w:val="single"/>
+      <w:b/>
+      <w:i/>
     </w:rPr>
+  </w:style>
+  <w:style w:type="table" w:styleId="TableGrid">
+    <w:name w:val="Table Grid"/>
   </w:style>
 </w:styles>
 </file>
</xml_diff>

<commit_message>
research: version 6 edits, manuscript frozen
Woolf re-verified from live data before editing: Q = 1.949, p = 0.163,
matching the manuscript. Corpus reconciliation clean: A1-A22 contiguous, A4
and A15 the only exclusions, forums 6+4+4+2+2+2 = 20.

Verification found an omission a reader would have misread: endnote 6 gave 20
of 32 FOIL matters as resolved without saying what the other 12 were. 32-20
would suggest 12 unresolved; in fact seven are contested with no disposition
and five drew audit findings, a separate category as in the employment corpus.
Composition now stated.

Five text edits applied and confirmed in the Word file: often preserved,
rather than providing a measure, the results of an outcome-based test,
did not record outcomes, most common.

28 checks against the docx and live database, 0 failed. 57 verifier checks,
0 failed. Body 2,997 words.

Co-Authored-By: Claude Opus 5 <noreply@anthropic.com>
Claude-Session: https://claude.ai/code/session_01W9UtE7X76spacWeSvBH7tv
</commit_message>
<xml_diff>
--- a/research/Employment_Records_Article_ISACA_2026-08-21.docx
+++ b/research/Employment_Records_Article_ISACA_2026-08-21.docx
@@ -431,7 +431,7 @@
         <w:t xml:space="preserve">Ready</w:t>
       </w:r>
       <w:r>
-        <w:t xml:space="preserve"> when the reasoning survives being read by a stranger: the file sources each factual claim, shows dates that reconcile, names who decided what and on what basis, and carries enough underlying material for a reader to test the conclusion. Ready records in this corpus commonly preserved quotations or other identifiable references to the underlying documentation.</w:t>
+        <w:t xml:space="preserve"> when the reasoning survives being read by a stranger: the file sources each factual claim, shows dates that reconcile, names who decided what and on what basis, and carries enough underlying material for a reader to test the conclusion. Ready records in this corpus often preserved quotations or other identifiable references to the underlying documentation.</w:t>
       </w:r>
     </w:p>
     <w:p>
@@ -448,7 +448,7 @@
         <w:t xml:space="preserve">Needs work</w:t>
       </w:r>
       <w:r>
-        <w:t xml:space="preserve"> when part of the basis is visible and part is asserted. The narrative is coherent, but at least one material claim traces to nothing a reader can check. The commonest form here was a conclusion about performance or conduct stated confidently, with the underlying observations described only in the drafter's summary.</w:t>
+        <w:t xml:space="preserve"> when part of the basis is visible and part is asserted. The narrative is coherent, but at least one material claim traces to nothing a reader can check. The most common form here was a confident conclusion about performance or conduct, with the underlying observations described only in the drafter's summary.</w:t>
       </w:r>
     </w:p>
     <w:p>
@@ -473,7 +473,7 @@
         <w:spacing w:after="140"/>
       </w:pPr>
       <w:r>
-        <w:t xml:space="preserve">For AI-assisted drafting, Needs work may be the more difficult failure mode to detect. A Gap record looks thin to anyone who opens it. A Needs work record can read well, follow the template and still carry material claims that cannot be independently checked, making it harder to catch in routine file-by-file review and more consequential when the record is later examined.</w:t>
+        <w:t xml:space="preserve">For AI-assisted drafting, Needs work may be the harder failure mode to detect. A Gap record looks thin to anyone who opens it. A Needs work record can read well, follow the template and still carry material claims that cannot be independently checked, making it harder to catch in routine review and more consequential when the record is later examined.</w:t>
       </w:r>
     </w:p>
     <w:p>
@@ -490,7 +490,7 @@
         <w:spacing w:after="140"/>
       </w:pPr>
       <w:r>
-        <w:t xml:space="preserve">Twenty-two matters were screened; 20 met the inclusion criteria and 2 were excluded. The 20 analyzed matters are drawn from 20 distinct published decisions across six adjudicating forums in two countries: the US Federal Labor Relations Authority (6), the New York Unemployment Insurance Appeal Board (4), the New York Appellate Division (4), the US Supreme Court (2), UK Employment Tribunals (2), and the US Equal Employment Opportunity Commission (2).</w:t>
+        <w:t xml:space="preserve">Twenty-two matters were screened; 20 met the inclusion criteria and 2 were excluded. The 20 are drawn from 20 distinct published decisions across six adjudicating forums in two countries: the US Federal Labor Relations Authority (6), the New York Unemployment Insurance Appeal Board (4), the New York Appellate Division (4), the US Supreme Court (2), UK Employment Tribunals (2), and the US Equal Employment Opportunity Commission (2).</w:t>
       </w:r>
       <w:r>
         <w:rPr>
@@ -535,7 +535,7 @@
         <w:spacing w:after="140"/>
       </w:pPr>
       <w:r>
-        <w:t xml:space="preserve">That design carries a circularity objection, and it is the first thing a careful reader should raise. The decision narrates the outcome and characterizes the employer's evidence, so the reviewer worked from a source already containing the outcome being assessed. The database stores one timestamp per case rather than two, so the ordering rests on the protocol rather than a system record.</w:t>
+        <w:t xml:space="preserve">That design carries a circularity objection, and it is the first thing a careful reader should raise. The decision narrates the outcome and characterizes the employer's evidence, so the reviewer worked from a source already containing the outcome being assessed. The database stores one timestamp per case, so the ordering rests on the protocol rather than a system record.</w:t>
       </w:r>
     </w:p>
     <w:p>
@@ -551,7 +551,7 @@
         <w:spacing w:after="140"/>
       </w:pPr>
       <w:r>
-        <w:t xml:space="preserve">This is a single-practitioner field pilot: one qualified specialist, one field application within an ordinary professional workflow. The findings are reported at that level.</w:t>
+        <w:t xml:space="preserve">This is a single-practitioner field pilot: one qualified specialist, one field application within an ordinary professional workflow. Findings are reported at that level.</w:t>
       </w:r>
     </w:p>
     <w:p>
@@ -576,7 +576,7 @@
         <w:spacing w:after="140"/>
       </w:pPr>
       <w:r>
-        <w:t xml:space="preserve">Needs work and Gap are grouped, since both describe a record whose basis is incomplete. For the primary analysis, an adverse finding was recorded where the employer's position did not survive review or where the matter drew an adverse audit or compliance finding.</w:t>
+        <w:t xml:space="preserve">Needs work and Gap are grouped, since both describe an incomplete basis. For the primary analysis, an adverse finding was recorded where the employer's position did not survive review or where the matter drew an adverse audit or compliance finding.</w:t>
       </w:r>
       <w:r>
         <w:rPr>
@@ -819,7 +819,7 @@
         <w:spacing w:after="140"/>
       </w:pPr>
       <w:r>
-        <w:t xml:space="preserve">The direction of the association is unchanged across the three specifications, but the result depends materially on how unresolved matters are treated. The evidence supports treating the finding as a control signal rather than as evidence of predictive validity. How to treat a contested matter with no recorded disposition should be fixed in a protocol before the next set is read.</w:t>
+        <w:t xml:space="preserve">The direction of the association is unchanged across the three specifications, but the result depends materially on how unresolved matters are treated. The evidence supports treating the finding as a control signal rather than as evidence of predictive validity. How to treat a contested matter with no disposition should be fixed in a protocol before the next set is read.</w:t>
       </w:r>
     </w:p>
     <w:p>
@@ -844,7 +844,7 @@
         <w:spacing w:after="140"/>
       </w:pPr>
       <w:r>
-        <w:t xml:space="preserve">The same review was applied by a different practitioner to 32 public-records determinations; that corpus did not track outcomes.</w:t>
+        <w:t xml:space="preserve">The same review was applied by a different practitioner to 32 public-records determinations; that corpus did not record outcomes.</w:t>
       </w:r>
       <w:r>
         <w:rPr>
@@ -858,7 +858,7 @@
         <w:spacing w:after="140"/>
       </w:pPr>
       <w:r>
-        <w:t xml:space="preserve">Freedom-of-information determinations reach publication because a legal or access question was contested, so publication does not imply the underlying file was typical of the broader record population. Fifteen of the 20 resolved determinations there did not survive. That distribution reflects the selection and publication process rather than how those agencies documented. The employment corpus is not filtered that way.</w:t>
+        <w:t xml:space="preserve">Freedom-of-information determinations reach publication because a legal or access question was contested, so publication does not imply the file was typical of the broader record population. Fifteen of the 20 resolved determinations there did not survive. That distribution reflects the selection and publication process rather than providing a measure of how those agencies documented. The employment corpus is not filtered that way.</w:t>
       </w:r>
     </w:p>
     <w:p>
@@ -875,7 +875,7 @@
         <w:t xml:space="preserve">7</w:t>
       </w:r>
       <w:r>
-        <w:t xml:space="preserve"> The difference illustrates how publication and selection processes can influence an outcome-based test of a documentation control.</w:t>
+        <w:t xml:space="preserve"> The difference illustrates how publication and selection processes can influence the results of an outcome-based test of a documentation control.</w:t>
       </w:r>
     </w:p>
     <w:p>
@@ -914,7 +914,7 @@
         <w:t xml:space="preserve">Narrative substitution.</w:t>
       </w:r>
       <w:r>
-        <w:t xml:space="preserve"> A decision is challenged and the organization cannot produce underlying documentation beyond the drafted narrative. The source material that would have supported the conclusion may not be attached when the narrative is treated as complete without it. In audit or dispute, that absence can become the central issue, and a sound decision has to be defended without the evidence that made it sound.</w:t>
+        <w:t xml:space="preserve"> A decision is challenged and the organization cannot produce underlying documentation beyond the drafted narrative. The source material that would have supported the conclusion may not be attached when the narrative is treated as complete without it. In audit or dispute, that absence can become the central issue, and a sound decision must be defended without the evidence that made it sound.</w:t>
       </w:r>
     </w:p>
     <w:p>
@@ -985,7 +985,7 @@
         <w:t xml:space="preserve">Anchor every material claim to independently verifiable source evidence.</w:t>
       </w:r>
       <w:r>
-        <w:t xml:space="preserve"> A material claim is one that contributes directly to the stated basis for the decision. The evidence must exist independently of the draft, such as logs, communications and measurable data.</w:t>
+        <w:t xml:space="preserve"> A material claim contributes directly to the stated basis for the decision. The evidence must exist independently of the draft, such as logs, communications and measurable data.</w:t>
       </w:r>
     </w:p>
     <w:p>
@@ -1161,7 +1161,7 @@
         <w:spacing w:after="140"/>
       </w:pPr>
       <w:r>
-        <w:t xml:space="preserve">A larger study should broaden the corpus without regard to how matters resolved, put at least two reviewers on each case with the classification and outcome recorded separately, fix the treatment of unresolved contests in advance, and where feasible obtain the underlying record independently of the adjudicated decision.</w:t>
+        <w:t xml:space="preserve">A larger study should broaden the corpus without regard to how matters resolved, put two reviewers on each case with the classification and outcome recorded separately, fix the treatment of unresolved contests in advance, and where feasible obtain the underlying record independently of the decision.</w:t>
       </w:r>
     </w:p>
     <w:p>
@@ -1228,7 +1228,7 @@
         <w:t xml:space="preserve">2.</w:t>
       </w:r>
       <w:r>
-        <w:t xml:space="preserve"> Twenty-two matters were screened and two are excluded. The first is a New York Committee on Open Government advisory opinion on a public-records request for disciplinary records: its subject is employment records but its forum and legal question are public records, so it belongs to the companion corpus. The second describes a capability dismissal but identifies no party, forum, date or case number, so it cannot be cited. Both exclusions were applied before the analysis, and both matters are named in appendix A so the full screened set can be reconstructed. Including both excluded matters produces p = 0.0073 with an odds ratio of 19.25. Because those matters do not meet the stated inclusion criteria, this result is reported only as a sensitivity analysis.</w:t>
+        <w:t xml:space="preserve"> Twenty-two matters were screened and two are excluded. The first is a New York Committee on Open Government advisory opinion on a public-records request for disciplinary records: its subject is employment records but its forum and legal question are public records, so it belongs to the companion corpus. The second describes a capability dismissal but identifies no party, forum, date or case number, so it cannot be cited. Both exclusions were applied before the analysis, and both are named in appendix A so the screened set can be reconstructed. Including them produces p = 0.0073 with an odds ratio of 19.25, reported only as a sensitivity analysis because they do not meet the stated inclusion criteria.</w:t>
       </w:r>
     </w:p>
     <w:p>
@@ -1317,7 +1317,7 @@
         <w:t xml:space="preserve">6.</w:t>
       </w:r>
       <w:r>
-        <w:t xml:space="preserve"> The public-records corpus comprises 32 determinations and audits reviewed by a different practitioner under the same five-condition protocol, without modification. The matters are New York State and City sources, principally Appellate Division decisions, Committee on Open Government advisory opinions and Comptroller audits, collected between 26 June and 8 August 2026 from published sources. Twenty carried a recorded disposition and are treated as resolved. That corpus is reported in full in a companion manuscript and is used here only for the homogeneity comparison.</w:t>
+        <w:t xml:space="preserve"> The public-records corpus comprises 32 determinations and audits reviewed by a different practitioner under the same five-condition protocol, without modification. The matters are New York State and City sources, principally Appellate Division decisions, Committee on Open Government advisory opinions and Comptroller audits, collected from published sources between 26 June and 8 August 2026. Twenty carried a recorded disposition and are treated as resolved. Of the remaining 12, seven were contested with no disposition and five drew audit findings, a separate category here as in the employment corpus. That corpus is reported in full in a companion manuscript and is used here only for the homogeneity comparison.</w:t>
       </w:r>
     </w:p>
     <w:p>

</xml_diff>